<commit_message>
Align EVM1110E syllabus final product to Stakeholder Management Plan; add tracked-changes copy
Part 4 and Sessions 13-15 now build and defend a Stakeholder Management
Plan with the KAP as its core (new 13.2 on integrating external
stakeholder coordination); AM7 row describes the SMP + defense; duplicate
Getz (2019) reference removed and main-text citation completed. Adds a
tracked-changes version against the original syllabus for faculty review.

Co-Authored-By: Claude Opus 5.5 <noreply@anthropic.com>
Claude-Session: https://claude.ai/code/session_01KLkwDpxn1QVeyYv1SKsfSs
</commit_message>
<xml_diff>
--- a/courses/EVM1110E/syllabus/EVM1110E_De_cuong_hieu_chinh.docx
+++ b/courses/EVM1110E/syllabus/EVM1110E_De_cuong_hieu_chinh.docx
@@ -13339,35 +13339,35 @@
                 <w:szCs w:val="22"/>
                 <w:rtl w:val="0"/>
               </w:rPr>
-              <w:t xml:space="preserve">PART 4: EVALUATION - DEFENDING THE KEY ACCOUNT PLAN PROJECT (3 Sessions) </w:t>
-            </w:r>
-          </w:p>
-          <w:p>
-            <w:pPr>
-              <w:pBdr>
-                <w:top w:space="0" w:sz="0" w:val="nil"/>
-                <w:left w:space="0" w:sz="0" w:val="nil"/>
-                <w:bottom w:space="0" w:sz="0" w:val="nil"/>
-                <w:right w:space="0" w:sz="0" w:val="nil"/>
-                <w:between w:space="0" w:sz="0" w:val="nil"/>
-              </w:pBdr>
-              <w:spacing w:line="276" w:lineRule="auto"/>
-              <w:rPr>
-                <w:b w:val="1"/>
-                <w:bCs w:val="1"/>
-                <w:sz w:val="22"/>
-                <w:szCs w:val="22"/>
-              </w:rPr>
-            </w:pPr>
-            <w:r>
-              <w:rPr>
-                <w:b w:val="1"/>
-                <w:bCs w:val="1"/>
-                <w:sz w:val="22"/>
-                <w:szCs w:val="22"/>
-                <w:rtl w:val="0"/>
-              </w:rPr>
-              <w:t xml:space="preserve">Session 13: Building the Key Account Plan (KAP)</w:t>
+              <w:t xml:space="preserve">PART 4: EVALUATION - DEFENDING THE STAKEHOLDER MANAGEMENT PLAN PROJECT (3 Sessions) </w:t>
+            </w:r>
+          </w:p>
+          <w:p>
+            <w:pPr>
+              <w:pBdr>
+                <w:top w:space="0" w:sz="0" w:val="nil"/>
+                <w:left w:space="0" w:sz="0" w:val="nil"/>
+                <w:bottom w:space="0" w:sz="0" w:val="nil"/>
+                <w:right w:space="0" w:sz="0" w:val="nil"/>
+                <w:between w:space="0" w:sz="0" w:val="nil"/>
+              </w:pBdr>
+              <w:spacing w:line="276" w:lineRule="auto"/>
+              <w:rPr>
+                <w:b w:val="1"/>
+                <w:bCs w:val="1"/>
+                <w:sz w:val="22"/>
+                <w:szCs w:val="22"/>
+              </w:rPr>
+            </w:pPr>
+            <w:r>
+              <w:rPr>
+                <w:b w:val="1"/>
+                <w:bCs w:val="1"/>
+                <w:sz w:val="22"/>
+                <w:szCs w:val="22"/>
+                <w:rtl w:val="0"/>
+              </w:rPr>
+              <w:t xml:space="preserve">Session 13: Building the Stakeholder Management Plan (SMP) around the Key Account Plan (KAP)</w:t>
             </w:r>
           </w:p>
           <w:p>
@@ -13385,6 +13385,23 @@
                 <w:rtl w:val="0"/>
               </w:rPr>
               <w:t xml:space="preserve">13.1 Applying the Value Planning Framework: (A) Value Insights, (B) Value Opportunities, (C) Value Propositions, (D) Value Delivery, (E) Executive Summary</w:t>
+            </w:r>
+          </w:p>
+          <w:p>
+            <w:pPr>
+              <w:spacing w:line="276" w:lineRule="auto"/>
+              <w:rPr>
+                <w:sz w:val="22"/>
+                <w:szCs w:val="22"/>
+              </w:rPr>
+            </w:pPr>
+            <w:r>
+              <w:rPr>
+                <w:sz w:val="22"/>
+                <w:szCs w:val="22"/>
+                <w:rtl w:val="0"/>
+              </w:rPr>
+              <w:t xml:space="preserve">13.2 Integrating external stakeholder coordination (investors &amp; sponsors, suppliers &amp; venues, media &amp; KOLs) into the Value Delivery section of the plan</w:t>
             </w:r>
           </w:p>
         </w:tc>
@@ -13882,7 +13899,7 @@
                 <w:szCs w:val="22"/>
                 <w:rtl w:val="0"/>
               </w:rPr>
-              <w:t xml:space="preserve">1. Students role-play as KAM Directors presenting their KAP projects to the "Customer Board" (Instructors)</w:t>
+              <w:t xml:space="preserve">1. Students role-play as KAM Directors presenting their Stakeholder Management Plans (built around the KAP) to the "Customer Board" (Instructors)</w:t>
             </w:r>
           </w:p>
           <w:p>
@@ -14943,7 +14960,7 @@
                 <w:szCs w:val="26"/>
                 <w:rtl w:val="0"/>
               </w:rPr>
-              <w:t xml:space="preserve">AM7 – Tiểu luận (Essay)</w:t>
+              <w:t xml:space="preserve">AM7 – Tiểu luận (Essay): Kế hoạch quản trị các bên liên quan (Stakeholder Management Plan) theo nhóm, bảo vệ và phản biện trực tiếp</w:t>
             </w:r>
           </w:p>
           <w:p>
@@ -15333,7 +15350,7 @@
                 <w:vertAlign w:val="baseline"/>
                 <w:rtl w:val="0"/>
               </w:rPr>
-              <w:t xml:space="preserve">Van Niekerk, M., &amp; Getz, D. (2019). Event stakeholders. NXB Oxford: Goodfellow Publishers.</w:t>
+              <w:t xml:space="preserve">Van Niekerk, M., &amp; Getz, D. (2019). Event stakeholders: Theory and methods for event management and tourism. NXB Oxford: Goodfellow Publishers.</w:t>
             </w:r>
           </w:p>
         </w:tc>
@@ -15472,47 +15489,6 @@
                 <w:rtl w:val="0"/>
               </w:rPr>
               <w:t xml:space="preserve">. NXB Taylor and Francis. </w:t>
-            </w:r>
-          </w:p>
-          <w:p>
-            <w:pPr>
-              <w:numPr>
-                <w:ilvl w:val="0"/>
-                <w:numId w:val="3"/>
-              </w:numPr>
-              <w:pBdr>
-                <w:top w:space="0" w:sz="0" w:val="nil"/>
-                <w:left w:space="0" w:sz="0" w:val="nil"/>
-                <w:bottom w:space="0" w:sz="0" w:val="nil"/>
-                <w:right w:space="0" w:sz="0" w:val="nil"/>
-                <w:between w:space="0" w:sz="0" w:val="nil"/>
-              </w:pBdr>
-              <w:spacing w:line="360" w:lineRule="auto"/>
-              <w:ind w:left="720" w:hanging="360"/>
-              <w:jc w:val="both"/>
-              <w:rPr>
-                <w:sz w:val="26"/>
-                <w:szCs w:val="26"/>
-              </w:rPr>
-            </w:pPr>
-            <w:hyperlink r:id="rId8">
-              <w:r>
-                <w:rPr>
-                  <w:sz w:val="26"/>
-                  <w:szCs w:val="26"/>
-                  <w:u w:val="single"/>
-                  <w:rtl w:val="0"/>
-                </w:rPr>
-                <w:t xml:space="preserve">Professor Donald Getz</w:t>
-              </w:r>
-            </w:hyperlink>
-            <w:r>
-              <w:rPr>
-                <w:sz w:val="26"/>
-                <w:szCs w:val="26"/>
-                <w:rtl w:val="0"/>
-              </w:rPr>
-              <w:t xml:space="preserve"> (2019). Event Stakeholders: Theory and Methods for Event Management and Tourism (Events Management and Methods). NXB Goodfellow Pub Ltd.</w:t>
             </w:r>
           </w:p>
         </w:tc>
@@ -17489,7 +17465,7 @@
                 <w:szCs w:val="22"/>
                 <w:rtl w:val="0"/>
               </w:rPr>
-              <w:t xml:space="preserve">REVIEW, Q&amp;A: Building &amp; defending the Key Account Plan (Sessions 13–15)</w:t>
+              <w:t xml:space="preserve">REVIEW, Q&amp;A: Building &amp; defending the Stakeholder Management Plan (Sessions 13–15)</w:t>
             </w:r>
           </w:p>
         </w:tc>

</xml_diff>